<commit_message>
Se acompletó los recursos y se modificó el documento word para los content controls Generador Contratos
</commit_message>
<xml_diff>
--- a/ERPSEI/wwwroot/templates/Contrato_Generado_EDIT.docx
+++ b/ERPSEI/wwwroot/templates/Contrato_Generado_EDIT.docx
@@ -14,7 +14,6 @@
       <w:r>
         <w:t>EMPRESA: &lt;&lt;</w:t>
       </w:r>
-      <w:proofErr w:type="spellStart"/>
       <w:sdt>
         <w:sdtPr>
           <w:alias w:val="Empresa"/>
@@ -28,7 +27,6 @@
           <w:r>
             <w:t>Empresa</w:t>
           </w:r>
-          <w:proofErr w:type="spellEnd"/>
         </w:sdtContent>
       </w:sdt>
       <w:r>
@@ -60,22 +58,94 @@
     </w:p>
     <w:p>
       <w:r>
-        <w:t>DOMICILIO EMPRESA: &lt;&lt;Domicilio_Empresa&gt;&gt;</w:t>
+        <w:t>DOMICILIO EMPRESA: &lt;&lt;</w:t>
+      </w:r>
+      <w:sdt>
+        <w:sdtPr>
+          <w:alias w:val="Domicilio_Empresa"/>
+          <w:tag w:val="Domicilio_Empresa"/>
+          <w:id w:val="-1581365617"/>
+          <w:placeholder>
+            <w:docPart w:val="DefaultPlaceholder_-1854013440"/>
+          </w:placeholder>
+        </w:sdtPr>
+        <w:sdtContent>
+          <w:r>
+            <w:t>Domicilio_Empresa</w:t>
+          </w:r>
+        </w:sdtContent>
+      </w:sdt>
+      <w:r>
+        <w:t>&gt;&gt;</w:t>
       </w:r>
     </w:p>
     <w:p>
       <w:r>
-        <w:t>CLIENTE: &lt;&lt;Cliente&gt;&gt;</w:t>
+        <w:t>CLIENTE: &lt;&lt;</w:t>
+      </w:r>
+      <w:sdt>
+        <w:sdtPr>
+          <w:alias w:val="Cliente"/>
+          <w:tag w:val="Cliente"/>
+          <w:id w:val="-1964575167"/>
+          <w:placeholder>
+            <w:docPart w:val="DefaultPlaceholder_-1854013440"/>
+          </w:placeholder>
+        </w:sdtPr>
+        <w:sdtContent>
+          <w:r>
+            <w:t>Cliente</w:t>
+          </w:r>
+        </w:sdtContent>
+      </w:sdt>
+      <w:r>
+        <w:t>&gt;&gt;</w:t>
       </w:r>
     </w:p>
     <w:p>
       <w:r>
-        <w:t>RFC CLIENTE: &lt;&lt;RFC_Cliente&gt;&gt;</w:t>
+        <w:t>RFC CLIENTE: &lt;&lt;</w:t>
+      </w:r>
+      <w:sdt>
+        <w:sdtPr>
+          <w:alias w:val="RFC_Cliente"/>
+          <w:tag w:val="RFC_Cliente"/>
+          <w:id w:val="-968129995"/>
+          <w:placeholder>
+            <w:docPart w:val="DefaultPlaceholder_-1854013440"/>
+          </w:placeholder>
+        </w:sdtPr>
+        <w:sdtContent>
+          <w:r>
+            <w:t>RFC Cliente</w:t>
+          </w:r>
+        </w:sdtContent>
+      </w:sdt>
+      <w:r>
+        <w:t>&gt;&gt;</w:t>
       </w:r>
     </w:p>
     <w:p>
       <w:r>
-        <w:t>DOMICILIO CLIENTE: &lt;&lt;Domicilio_Cliente&gt;&gt;</w:t>
+        <w:t>DOMICILIO CLIENTE: &lt;&lt;</w:t>
+      </w:r>
+      <w:sdt>
+        <w:sdtPr>
+          <w:alias w:val="Domicilio Cliente"/>
+          <w:tag w:val="Domicilio Cliente"/>
+          <w:id w:val="-1205008852"/>
+          <w:placeholder>
+            <w:docPart w:val="DefaultPlaceholder_-1854013440"/>
+          </w:placeholder>
+        </w:sdtPr>
+        <w:sdtContent>
+          <w:r>
+            <w:t>Domicilio Cliente</w:t>
+          </w:r>
+        </w:sdtContent>
+      </w:sdt>
+      <w:r>
+        <w:t>&gt;&gt;</w:t>
       </w:r>
     </w:p>
     <w:p>
@@ -11809,7 +11879,10 @@
   <w:rsids>
     <w:rsidRoot w:val="000577E4"/>
     <w:rsid w:val="000577E4"/>
+    <w:rsid w:val="003D030F"/>
+    <w:rsid w:val="00575065"/>
     <w:rsid w:val="006F24D8"/>
+    <w:rsid w:val="00990331"/>
     <w:rsid w:val="00DD0DAC"/>
   </w:rsids>
   <m:mathPr>

</xml_diff>